<commit_message>
update train the trainer
</commit_message>
<xml_diff>
--- a/docs/free-rwe-resources/train-the-trainer/training/day-03-cohort-definitions/tutorial/Cohort-Definitions-Basics-and-Atlas.docx
+++ b/docs/free-rwe-resources/train-the-trainer/training/day-03-cohort-definitions/tutorial/Cohort-Definitions-Basics-and-Atlas.docx
@@ -371,7 +371,7 @@
         <w:t>concept set</w:t>
       </w:r>
       <w:r>
-        <w:t>, which is a collection of standard codes that together represent the concept (e.g. a concept set of all drugs that contain metformin)</w:t>
+        <w:t>, which is a collection of standard concepts that together represent the idea (e.g. a concept set of all drugs that contain metformin)</w:t>
       </w:r>
       <w:hyperlink r:id="rId16" w:anchor=":~:text=The%20screen%20will%20update%20with,is%20associated%20to%20ACE%20inhibitors">
         <w:r>
@@ -447,7 +447,7 @@
         </w:r>
       </w:hyperlink>
       <w:r>
-        <w:t>. For example, a “Type 2 Diabetes” concept set might include all SNOMED concepts and ICD codes mapped to Type 2 Diabetes, and a “Metformin” concept set might include the RxNorm code for metformin and all its descendant concepts (specific brands, forms, etc.)</w:t>
+        <w:t>. For example, a “Type 2 Diabetes” concept set might include the standard SNOMED concept for Type 2 Diabetes and its descendants (the ICD codes that map to them are then covered without being listed), and a “Metformin” concept set might include the RxNorm code for metformin and all its descendant concepts (specific brands, forms, etc.)</w:t>
       </w:r>
       <w:hyperlink r:id="rId20" w:anchor=":~:text=Figure%2010,coding%20systems%20that%20are%20implied">
         <w:r>
@@ -468,7 +468,7 @@
         <w:t>In ATLAS, you either create concept sets or import existing ones to use in your cohort criteria.</w:t>
       </w:r>
       <w:r>
-        <w:t xml:space="preserve"> (The audience is already familiar with creating concept sets, so the key point is how they’re used within the cohort definition.)</w:t>
+        <w:t xml:space="preserve"/>
       </w:r>
     </w:p>
     <w:p>
@@ -740,8 +740,6 @@
       </w:hyperlink>
       <w:r>
         <w:t xml:space="preserve">. Alternatively, a simpler approach is to have cohort exit on a pre-specified time interval (say, 1 year after index) or at observation period end if no specific event terminates membership. The choice of exit criteria will impact whether a person can re-enter the cohort: for instance, if a cohort is defined as an ongoing exposure, a person could leave upon stopping the drug and possibly re-enter if they qualify </w:t>
-      </w:r>
-      <w:r>
         <w:lastRenderedPageBreak/>
         <w:t>again later (as long as re-entry criteria are satisfied and the cohort design allows it)</w:t>
       </w:r>
@@ -1062,8 +1060,6 @@
       </w:r>
       <w:r>
         <w:t xml:space="preserve"> to the initial event. </w:t>
-      </w:r>
-      <w:r>
         <w:lastRenderedPageBreak/>
         <w:t xml:space="preserve">For example, we want only the </w:t>
       </w:r>
@@ -1414,8 +1410,6 @@
       </w:r>
       <w:r>
         <w:t xml:space="preserve"> criterion for prior diabetes drugs by formulating it as an inclusion rule: e.g., “No prior exposure to other anti-diabetic drugs.” In ATLAS, this </w:t>
-      </w:r>
-      <w:r>
         <w:lastRenderedPageBreak/>
         <w:t xml:space="preserve">would be a new inclusion criterion where we add a </w:t>
       </w:r>
@@ -1681,18 +1675,7 @@
         </w:r>
       </w:hyperlink>
       <w:r>
-        <w:t xml:space="preserve">. Cohort definitions are indeed the cornerstone of OHDSI </w:t>
-      </w:r>
-      <w:proofErr w:type="gramStart"/>
-      <w:r>
-        <w:t>analytics, and</w:t>
-      </w:r>
-      <w:proofErr w:type="gramEnd"/>
-      <w:r>
-        <w:t xml:space="preserve"> mastering them is a key learning outcome for anyone involved in observational health data analysis.</w:t>
-      </w:r>
-      <w:r>
-        <w:t xml:space="preserve"> </w:t>
+        <w:t xml:space="preserve">. Cohort definitions are indeed the cornerstone of OHDSI analytics, and mastering them is a key learning outcome for anyone involved in observational health data analysis. </w:t>
       </w:r>
       <w:bookmarkEnd w:id="1"/>
       <w:bookmarkEnd w:id="2"/>

</xml_diff>

<commit_message>
update train the trainer w ALS only
</commit_message>
<xml_diff>
--- a/docs/free-rwe-resources/train-the-trainer/training/day-03-cohort-definitions/tutorial/Cohort-Definitions-Basics-and-Atlas.docx
+++ b/docs/free-rwe-resources/train-the-trainer/training/day-03-cohort-definitions/tutorial/Cohort-Definitions-Basics-and-Atlas.docx
@@ -80,7 +80,7 @@
         </w:r>
       </w:hyperlink>
       <w:r>
-        <w:t xml:space="preserve">. For example, a study of diabetes drug effects might define one cohort for patients with type 2 diabetes initiating a specific medication (the exposure cohort) and another cohort for those experiencing a certain outcome (the outcome cohort). Cohort definitions in OHDSI are </w:t>
+        <w:t xml:space="preserve">. For example, a study of ALS medication effects might define one cohort for patients with motor neuron disease initiating a specific medication (the exposure cohort) and another cohort for those experiencing a certain outcome (the outcome cohort). Cohort definitions in OHDSI are </w:t>
       </w:r>
       <w:r>
         <w:rPr>
@@ -90,7 +90,7 @@
         <w:t>reusable and shareable</w:t>
       </w:r>
       <w:r>
-        <w:t xml:space="preserve"> – once defined, a cohort (say, “Type 2 Diabetes patients on Metformin”) can be reused in multiple studies or analyses as needed</w:t>
+        <w:t xml:space="preserve"> – once defined, a cohort (say, “motor neuron disease patients on Riluzole”) can be reused in multiple studies or analyses as needed</w:t>
       </w:r>
       <w:hyperlink r:id="rId9" w:anchor=":~:text=executing%20a%20research%20question,in%20other%20analyses%2C%20for%20example">
         <w:r>
@@ -150,7 +150,7 @@
         </w:r>
       </w:hyperlink>
       <w:r>
-        <w:t xml:space="preserve">. In other words, a cohort requires logic: for instance, does the presence of a diabetes diagnosis code make someone a cohort member at any time, or only if it’s the first such diagnosis? How long do they remain in the cohort after that event? A well-defined cohort explicitly details </w:t>
+        <w:t xml:space="preserve">. In other words, a cohort requires logic: for instance, does the presence of a motor neuron disease diagnosis code make someone a cohort member at any time, or only if it’s the first such diagnosis? How long do they remain in the cohort after that event? A well-defined cohort explicitly details </w:t>
       </w:r>
       <w:r>
         <w:rPr>
@@ -178,7 +178,7 @@
         </w:r>
       </w:hyperlink>
       <w:r>
-        <w:t>. Designing these definitions is crucial because observational health databases (electronic health records, insurance claims, etc.) often require inference – we must translate clinical ideas (like “new onset Type 2 Diabetes”) into criteria using the data elements available</w:t>
+        <w:t>. Designing these definitions is crucial because observational health databases (electronic health records, insurance claims, etc.) often require inference – we must translate clinical ideas (like “new onset motor neuron disease”) into criteria using the data elements available</w:t>
       </w:r>
       <w:hyperlink r:id="rId12" w:anchor=":~:text=captured%20in%20the%20data%20to,we%20design%20a%20study%2C%20we">
         <w:r>
@@ -358,7 +358,7 @@
           <w:i/>
           <w:iCs/>
         </w:rPr>
-        <w:t>For instance, if we define a cohort of “new users of Metformin,” the initial event might be a record in the Drug Exposure domain for a metformin prescription or dispense.</w:t>
+        <w:t>For instance, if we define a cohort of “new users of Riluzole,” the initial event might be a record in the Drug Exposure domain for a riluzole prescription or dispense.</w:t>
       </w:r>
       <w:r>
         <w:t xml:space="preserve"> We typically represent the clinical idea of interest using a </w:t>
@@ -371,7 +371,7 @@
         <w:t>concept set</w:t>
       </w:r>
       <w:r>
-        <w:t>, which is a collection of standard concepts that together represent the idea (e.g. a concept set of all drugs that contain metformin)</w:t>
+        <w:t>, which is a collection of standard concepts that together represent the idea (e.g. a concept set of all drugs that contain riluzole)</w:t>
       </w:r>
       <w:hyperlink r:id="rId16" w:anchor=":~:text=The%20screen%20will%20update%20with,is%20associated%20to%20ACE%20inhibitors">
         <w:r>
@@ -447,7 +447,7 @@
         </w:r>
       </w:hyperlink>
       <w:r>
-        <w:t>. For example, a “Type 2 Diabetes” concept set might include the standard SNOMED concept for Type 2 Diabetes and its descendants (the ICD codes that map to them are then covered without being listed), and a “Metformin” concept set might include the RxNorm code for metformin and all its descendant concepts (specific brands, forms, etc.)</w:t>
+        <w:t>. For example, a “motor neuron disease” concept set might include the standard SNOMED concept for motor neuron disease and its descendants (the ICD codes that map to them are then covered without being listed), and a “Riluzole” concept set might include the RxNorm code for riluzole and all its descendant concepts (specific brands, forms, etc.)</w:t>
       </w:r>
       <w:hyperlink r:id="rId20" w:anchor=":~:text=Figure%2010,coding%20systems%20that%20are%20implied">
         <w:r>
@@ -515,10 +515,10 @@
           <w:i/>
           <w:iCs/>
         </w:rPr>
-        <w:t>“the person had at least one Type 2 Diabetes diagnosis in the year before the index date.”</w:t>
-      </w:r>
-      <w:r>
-        <w:t xml:space="preserve"> This criterion would use the Condition domain with a “Type 2 Diabetes” concept set, and temporal logic requiring it to occur 365 days before or up to the index date. Multiple inclusion rules can be added to a cohort definition; a person must satisfy </w:t>
+        <w:t>“the person had at least one motor neuron disease diagnosis in the year before the index date.”</w:t>
+      </w:r>
+      <w:r>
+        <w:t xml:space="preserve"> This criterion would use the Condition domain with a “motor neuron disease” concept set, and temporal logic requiring it to occur 365 days before or up to the index date. Multiple inclusion rules can be added to a cohort definition; a person must satisfy </w:t>
       </w:r>
       <w:r>
         <w:rPr>
@@ -580,7 +580,7 @@
         </w:r>
       </w:hyperlink>
       <w:r>
-        <w:t xml:space="preserve">. For example, if you want to exclude patients with prior insulin use from a “new metformin users” cohort, you would implement this as an inclusion rule like “include only patients with </w:t>
+        <w:t xml:space="preserve">. For example, if you want to exclude patients with prior edaravone use from a “new riluzole users” cohort, you would implement this as an inclusion rule like “include only patients with </w:t>
       </w:r>
       <w:r>
         <w:rPr>
@@ -590,7 +590,7 @@
         <w:t>0 occurrences</w:t>
       </w:r>
       <w:r>
-        <w:t xml:space="preserve"> of insulin use in the year before index.” In ATLAS, you use logic operators (e.g., “exactly 0 occurrences”) to handle such conditions</w:t>
+        <w:t xml:space="preserve"> of edaravone use in the year before index.” In ATLAS, you use logic operators (e.g., “exactly 0 occurrences”) to handle such conditions</w:t>
       </w:r>
       <w:hyperlink r:id="rId26" w:anchor=":~:text=You%20may%20be%20confused%20why,operators%20available%20in%20ATLAS%20criteria">
         <w:r>
@@ -718,7 +718,7 @@
         </w:r>
       </w:hyperlink>
       <w:r>
-        <w:t xml:space="preserve">. Often, cohorts are defined to end when the person's observation period ends (i.e., they are no longer in the database), or at a fixed time after index (e.g., end the cohort 30 days after a drug prescription for an outcome study). In other cases, the exit might be tied to the end of a condition episode or the end of a course of therapy. For example, in a drug exposure cohort of “new users of Metformin,” one might choose to have each person exit the cohort when they discontinue the drug – effectively, the cohort could be defined to last through the </w:t>
+        <w:t xml:space="preserve">. Often, cohorts are defined to end when the person's observation period ends (i.e., they are no longer in the database), or at a fixed time after index (e.g., end the cohort 30 days after a drug prescription for an outcome study). In other cases, the exit might be tied to the end of a condition episode or the end of a course of therapy. For example, in a drug exposure cohort of “new users of Riluzole,” one might choose to have each person exit the cohort when they discontinue the drug – effectively, the cohort could be defined to last through the </w:t>
       </w:r>
       <w:r>
         <w:rPr>
@@ -786,14 +786,14 @@
         <w:pStyle w:val="FirstParagraph"/>
       </w:pPr>
       <w:r>
-        <w:t xml:space="preserve">ATLAS is OHDSI’s graphical interface for creating and exploring cohort definitions without writing SQL code. Below is a step-by-step tour of how to define a cohort in ATLAS, illustrating the process with an example use case. We’ll use a diabetes-related scenario: </w:t>
-      </w:r>
-      <w:r>
-        <w:rPr>
-          <w:b/>
-          <w:bCs/>
-        </w:rPr>
-        <w:t>“Cohort of patients with Type 2 Diabetes who start Metformin (a common diabetes drug) for the first time.”</w:t>
+        <w:t xml:space="preserve">ATLAS is OHDSI’s graphical interface for creating and exploring cohort definitions without writing SQL code. Below is a step-by-step tour of how to define a cohort in ATLAS, illustrating the process with an example use case. We’ll use an ALS scenario: </w:t>
+      </w:r>
+      <w:r>
+        <w:rPr>
+          <w:b/>
+          <w:bCs/>
+        </w:rPr>
+        <w:t>“Cohort of patients with motor neuron disease who start Riluzole (a medication used in ALS) for the first time.”</w:t>
       </w:r>
       <w:r>
         <w:t xml:space="preserve"> This example will demonstrate defining the initial event, applying inclusion criteria (including an exclusion implemented as an absence), and specifying cohort exit, using ATLAS’s cohort definition interface.</w:t>
@@ -849,7 +849,7 @@
           <w:i/>
           <w:iCs/>
         </w:rPr>
-        <w:t>“New Metformin Users with Type 2 Diabetes”</w:t>
+        <w:t>“New Riluzole Users with motor neuron disease”</w:t>
       </w:r>
       <w:r>
         <w:t>). ATLAS will not allow duplicate cohort names, so choose a unique title</w:t>
@@ -895,7 +895,7 @@
           <w:i/>
           <w:iCs/>
         </w:rPr>
-        <w:t>initiating metformin therapy</w:t>
+        <w:t>initiating riluzole therapy</w:t>
       </w:r>
       <w:r>
         <w:t xml:space="preserve">. In ATLAS, click </w:t>
@@ -960,7 +960,7 @@
         <w:t>which drug</w:t>
       </w:r>
       <w:r>
-        <w:t xml:space="preserve"> we mean – in this case, metformin. This is done by attaching a </w:t>
+        <w:t xml:space="preserve"> we mean – in this case, riluzole. This is done by attaching a </w:t>
       </w:r>
       <w:r>
         <w:rPr>
@@ -970,7 +970,7 @@
         <w:t>concept set</w:t>
       </w:r>
       <w:r>
-        <w:t xml:space="preserve"> for metformin to the criterion</w:t>
+        <w:t xml:space="preserve"> for riluzole to the criterion</w:t>
       </w:r>
       <w:hyperlink r:id="rId38" w:anchor=":~:text=The%20screen%20will%20update%20with,is%20associated%20to%20ACE%20inhibitors">
         <w:r>
@@ -981,7 +981,7 @@
         </w:r>
       </w:hyperlink>
       <w:r>
-        <w:t xml:space="preserve">. If you already created a concept set for “Metformin and its descendants” in a previous session, you can import it now (ATLAS provides an option to </w:t>
+        <w:t xml:space="preserve">. If you already created a concept set for “Riluzole and its descendants” in a previous session, you can import it now (ATLAS provides an option to </w:t>
       </w:r>
       <w:r>
         <w:rPr>
@@ -1012,7 +1012,7 @@
         <w:t>“New Concept Set”</w:t>
       </w:r>
       <w:r>
-        <w:t>, search the vocabulary for Metformin, and add all relevant metformin ingredient concepts (including descendants, so that all forms of metformin are captured)</w:t>
+        <w:t>, search the vocabulary for Riluzole, and add all relevant riluzole ingredient concepts (including descendants, so that all forms of riluzole are captured)</w:t>
       </w:r>
       <w:hyperlink r:id="rId40" w:anchor=":~:text=,Not%20Built%20a%20Concept%20Set">
         <w:r>
@@ -1031,7 +1031,7 @@
         </w:r>
       </w:hyperlink>
       <w:r>
-        <w:t>. Once the concept set is attached, the initial event criterion essentially reads “Drug Exposure of any metformin (ingredient or descendant)”.</w:t>
+        <w:t>. Once the concept set is attached, the initial event criterion essentially reads “Drug Exposure of any riluzole (ingredient or descendant)”.</w:t>
       </w:r>
     </w:p>
     <w:p>
@@ -1039,7 +1039,7 @@
         <w:pStyle w:val="BodyText"/>
       </w:pPr>
       <w:r>
-        <w:t xml:space="preserve">At this point, all drug exposures of metformin in the data would qualify as entry events. However, our cohort is intended to capture </w:t>
+        <w:t xml:space="preserve">At this point, all drug exposures of riluzole in the data would qualify as entry events. However, our cohort is intended to capture </w:t>
       </w:r>
       <w:r>
         <w:rPr>
@@ -1049,7 +1049,7 @@
         <w:t>new users</w:t>
       </w:r>
       <w:r>
-        <w:t xml:space="preserve"> of metformin, so we need to refine the entry criteria further. ATLAS allows adding </w:t>
+        <w:t xml:space="preserve"> of riluzole, so we need to refine the entry criteria further. ATLAS allows adding </w:t>
       </w:r>
       <w:r>
         <w:rPr>
@@ -1071,7 +1071,7 @@
         <w:t>first-ever use</w:t>
       </w:r>
       <w:r>
-        <w:t xml:space="preserve"> of metformin for each person. To enforce that, we click </w:t>
+        <w:t xml:space="preserve"> of riluzole for each person. To enforce that, we click </w:t>
       </w:r>
       <w:r>
         <w:rPr>
@@ -1164,7 +1164,7 @@
         <w:t>washout period</w:t>
       </w:r>
       <w:r>
-        <w:t xml:space="preserve"> helps ensure the drug initiation is new (we have one year of prior data with no metformin). We also typically restrict to the </w:t>
+        <w:t xml:space="preserve"> helps ensure the drug initiation is new (we have one year of prior data with no riluzole). We also typically restrict to the </w:t>
       </w:r>
       <w:r>
         <w:rPr>
@@ -1192,7 +1192,7 @@
           <w:i/>
           <w:iCs/>
         </w:rPr>
-        <w:t>“First-ever Metformin Drug Exposure for a person, with at least 1 year of prior continuous observation.”</w:t>
+        <w:t>“First-ever Riluzole Drug Exposure for a person, with at least 1 year of prior continuous observation.”</w:t>
       </w:r>
       <w:r>
         <w:t xml:space="preserve"> All people who have such an event will form the initial set of cohort candidates.</w:t>
@@ -1210,7 +1210,7 @@
         <w:t>3. Add Inclusion Criteria (Additional Qualifying Conditions):</w:t>
       </w:r>
       <w:r>
-        <w:t xml:space="preserve"> Now we refine the cohort by specifying additional inclusion criteria that those initial events must meet. In our example, we want to include only patients who have Type 2 Diabetes, since we’re focusing on diabetic patients starting metformin. In ATLAS, you have two ways to apply further criteria: (a) </w:t>
+        <w:t xml:space="preserve"> Now we refine the cohort by specifying additional inclusion criteria that those initial events must meet. In our example, we want to include only patients who have motor neuron disease, since we’re focusing on people with motor neuron disease starting riluzole. In ATLAS, you have two ways to apply further criteria: (a) </w:t>
       </w:r>
       <w:r>
         <w:rPr>
@@ -1280,7 +1280,7 @@
         <w:t>“New Inclusion Criteria”</w:t>
       </w:r>
       <w:r>
-        <w:t>. You can give each rule a brief name/description (e.g., “Has Type 2 Diabetes diagnosis before index”) for clarity</w:t>
+        <w:t>. You can give each rule a brief name/description (e.g., “Has motor neuron disease diagnosis before index”) for clarity</w:t>
       </w:r>
       <w:hyperlink r:id="rId48" w:anchor=":~:text=You%20will%20now%20want%20to,of%20the%20cohort%20you%20are">
         <w:r>
@@ -1312,7 +1312,7 @@
         </w:r>
       </w:hyperlink>
       <w:r>
-        <w:t xml:space="preserve">. For a diabetes diagnosis, choose the </w:t>
+        <w:t xml:space="preserve">. For a motor neuron disease diagnosis, choose the </w:t>
       </w:r>
       <w:r>
         <w:rPr>
@@ -1332,7 +1332,7 @@
         <w:t>concept set</w:t>
       </w:r>
       <w:r>
-        <w:t xml:space="preserve"> for “Type 2 Diabetes Mellitus” (this concept set would include all relevant diagnosis codes for T2DM). Next, set the </w:t>
+        <w:t xml:space="preserve"> for “motor neuron disease” (this concept set would include all relevant diagnosis codes for motor neuron disease). Next, set the </w:t>
       </w:r>
       <w:r>
         <w:rPr>
@@ -1342,7 +1342,7 @@
         <w:t>temporal logic</w:t>
       </w:r>
       <w:r>
-        <w:t xml:space="preserve">: we might require “at least one occurrence of T2DM </w:t>
+        <w:t xml:space="preserve">: we might require “at least one occurrence of motor neuron disease </w:t>
       </w:r>
       <w:r>
         <w:rPr>
@@ -1362,7 +1362,7 @@
         <w:t>between 365 days before and 0 days after index</w:t>
       </w:r>
       <w:r>
-        <w:t xml:space="preserve"> (meaning in the year prior up to the day of the metformin start)</w:t>
+        <w:t xml:space="preserve"> (meaning in the year prior up to the day of the riluzole start)</w:t>
       </w:r>
       <w:hyperlink r:id="rId50" w:anchor=":~:text=specific%20the%20criteria%20and%20add,the%20cohort%20you%20are%20defining">
         <w:r>
@@ -1381,7 +1381,7 @@
         </w:r>
       </w:hyperlink>
       <w:r>
-        <w:t>. This criterion will ensure the cohort only includes people who were known to have Type 2 Diabetes when they initiated metformin, as opposed to people taking metformin for other reasons. If desired, additional inclusion rules can be added similarly (they all must be satisfied).</w:t>
+        <w:t>. This criterion will ensure the cohort only includes people who were known to have motor neuron disease when they initiated riluzole, as opposed to people taking riluzole for other reasons. If desired, additional inclusion rules can be added similarly (they all must be satisfied).</w:t>
       </w:r>
     </w:p>
     <w:p>
@@ -1399,7 +1399,7 @@
         <w:t>any</w:t>
       </w:r>
       <w:r>
-        <w:t xml:space="preserve"> other diabetes medication (making metformin their first diabetes treatment). We could add an </w:t>
+        <w:t xml:space="preserve"> other ALS medication (making riluzole their first ALS medication). We could add an </w:t>
       </w:r>
       <w:r>
         <w:rPr>
@@ -1409,7 +1409,7 @@
         <w:t>exclusion</w:t>
       </w:r>
       <w:r>
-        <w:t xml:space="preserve"> criterion for prior diabetes drugs by formulating it as an inclusion rule: e.g., “No prior exposure to other anti-diabetic drugs.” In ATLAS, this </w:t>
+        <w:t xml:space="preserve"> criterion for prior ALS medications by formulating it as an inclusion rule: e.g., “No prior exposure to other ALS medications.” In ATLAS, this </w:t>
         <w:lastRenderedPageBreak/>
         <w:t xml:space="preserve">would be a new inclusion criterion where we add a </w:t>
       </w:r>
@@ -1421,7 +1421,7 @@
         <w:t>Drug Exposure</w:t>
       </w:r>
       <w:r>
-        <w:t xml:space="preserve"> criterion for a concept set of “All other diabetes medications” and specify </w:t>
+        <w:t xml:space="preserve"> criterion for a concept set of “All other ALS medications” and specify </w:t>
       </w:r>
       <w:r>
         <w:rPr>
@@ -1473,7 +1473,7 @@
         </w:r>
       </w:hyperlink>
       <w:r>
-        <w:t>. This demonstrates how what is conceptually an exclusion (exclude people with prior other drugs) is implemented as an inclusion rule requiring zero occurrences. Each inclusion criterion you add will be evaluated in sequence when the cohort is generated, and ATLAS can display how many people are lost at each step (e.g., how many metformin initiators did not have a T2DM diagnosis and thus were dropped, etc.). Using inclusion rules in this way provides transparency on the cohort definition’s impact</w:t>
+        <w:t>. This demonstrates how what is conceptually an exclusion (exclude people with prior other drugs) is implemented as an inclusion rule requiring zero occurrences. Each inclusion criterion you add will be evaluated in sequence when the cohort is generated, and ATLAS can display how many people are lost at each step (e.g., how many riluzole initiators did not have a motor neuron disease diagnosis and thus were dropped, etc.). Using inclusion rules in this way provides transparency on the cohort definition’s impact</w:t>
       </w:r>
       <w:hyperlink r:id="rId54" w:anchor=":~:text=Once%20we%20have%20specified%20a,the%20Inclusion%20Criteria%20section%20so">
         <w:r>
@@ -1509,7 +1509,7 @@
         <w:t>cohort exit rules</w:t>
       </w:r>
       <w:r>
-        <w:t xml:space="preserve">. This determines how long each person remains in the cohort after their index event. By default, if you don’t specify anything, ATLAS may use the end of observation period as the cohort end. However, it’s often useful to be explicit. For our “new metformin users” example, if the cohort is intended for, say, a study of outcomes within one year of starting metformin, we might set the cohort exit as a fixed time point (e.g., 365 days after index date). Alternatively, if we are interested in the treatment era, we could define exit as the end of continuous metformin exposure. In ATLAS, you can specify exit by choosing options like </w:t>
+        <w:t xml:space="preserve">. This determines how long each person remains in the cohort after their index event. By default, if you don’t specify anything, ATLAS may use the end of observation period as the cohort end. However, it’s often useful to be explicit. For our “new riluzole users” example, if the cohort is intended for, say, a study of outcomes within one year of starting riluzole, we might set the cohort exit as a fixed time point (e.g., 365 days after index date). Alternatively, if we are interested in the treatment era, we could define exit as the end of continuous riluzole exposure. In ATLAS, you can specify exit by choosing options like </w:t>
       </w:r>
       <w:r>
         <w:rPr>
@@ -1597,7 +1597,7 @@
         <w:t>generate</w:t>
       </w:r>
       <w:r>
-        <w:t xml:space="preserve"> the cohort on your dataset (if connected to a database) to see how many patients meet the definition and inspect the inclusion criteria attrition chart. The inclusion impact (attrition) chart will show, for example, how many patients started metformin (initial events count), how many of those had prior T2DM, how many had no prior other drugs, etc., at each step – this feedback is valuable for validating your cohort. Finally, ATLAS provides an </w:t>
+        <w:t xml:space="preserve"> the cohort on your dataset (if connected to a database) to see how many patients meet the definition and inspect the inclusion criteria attrition chart. The inclusion impact (attrition) chart will show, for example, how many patients started riluzole (initial events count), how many of those had prior motor neuron disease, how many had no prior other drugs, etc., at each step – this feedback is valuable for validating your cohort. Finally, ATLAS provides an </w:t>
       </w:r>
       <w:r>
         <w:rPr>
@@ -1638,7 +1638,7 @@
       </w:pPr>
       <w:r>
         <w:lastRenderedPageBreak/>
-        <w:t>By following these steps in ATLAS, we have created an example cohort of “new metformin users with Type 2 diabetes.” Throughout this process, we covered the basics of cohort definitions: defining a clear entry event (with concept sets representing clinical ideas), applying inclusion criteria (and how to handle exclusions via zero-occurrence rules), and setting appropriate cohort exit logic. Each of these components corresponds to key terms and concepts used in OHDSI cohort generation.</w:t>
+        <w:t>By following these steps in ATLAS, we have created an example cohort of “new riluzole users with motor neuron disease.” Throughout this process, we covered the basics of cohort definitions: defining a clear entry event (with concept sets representing clinical ideas), applying inclusion criteria (and how to handle exclusions via zero-occurrence rules), and setting appropriate cohort exit logic. Each of these components corresponds to key terms and concepts used in OHDSI cohort generation.</w:t>
       </w:r>
     </w:p>
     <w:p>

</xml_diff>